<commit_message>
Add homework 4, update homework 2 and 3 files
Co-Authored-By: Claude Sonnet 5.5 <noreply@anthropic.com>
</commit_message>
<xml_diff>
--- a/03_homework/03_homework_assessment.docx
+++ b/03_homework/03_homework_assessment.docx
@@ -76,13 +76,8 @@
         </w:numPr>
         <w:spacing w:after="192"/>
       </w:pPr>
-      <w:proofErr w:type="gramStart"/>
-      <w:r>
-        <w:t>So</w:t>
-      </w:r>
-      <w:proofErr w:type="gramEnd"/>
-      <w:r>
-        <w:t xml:space="preserve"> I started the homework</w:t>
+      <w:r>
+        <w:t>I started the homework</w:t>
       </w:r>
       <w:r>
         <w:t xml:space="preserve"> by reading the “Tidy Data” paper by Wickham. I tried taking some notes to remember the most important things.</w:t>
@@ -98,7 +93,13 @@
         <w:spacing w:after="192"/>
       </w:pPr>
       <w:r>
-        <w:t>Afterwards, I started with the intro to Pandas. Firstly, I looked at the “10min tutorial for a quick start”. This felt a little bit confusing to me, which is why I switched to the Getting started tutorials. These were a lot easier to understand. I have worked in R already and, for my surprise, there are some similarities.</w:t>
+        <w:t xml:space="preserve">Afterwards, I started with the intro to Pandas. Firstly, I looked at the “10min tutorial for a quick start”. This felt a little bit confusing to me, which is why I switched to the Getting started tutorials. These were a lot easier to understand. I have worked in R already and, </w:t>
+      </w:r>
+      <w:r>
+        <w:t>to</w:t>
+      </w:r>
+      <w:r>
+        <w:t xml:space="preserve"> my surprise, there are some similarities.</w:t>
       </w:r>
     </w:p>
     <w:p>
@@ -111,7 +112,29 @@
         <w:spacing w:after="192"/>
       </w:pPr>
       <w:r>
-        <w:t>For the practice part, I chose the Disney dataset. I basically worked through the five tasks. This took way longer than expected. It still helped a lot to understand Pandas further (just by reading, it is harder for me to remember things).</w:t>
+        <w:t xml:space="preserve">For the practice part, I chose the Disney dataset. I basically worked through the five tasks. </w:t>
+      </w:r>
+      <w:r>
+        <w:t xml:space="preserve">I </w:t>
+      </w:r>
+      <w:proofErr w:type="spellStart"/>
+      <w:r>
+        <w:t>analysed</w:t>
+      </w:r>
+      <w:proofErr w:type="spellEnd"/>
+      <w:r>
+        <w:t xml:space="preserve"> whether the release season of a Disney movie is related to its vote-weighted IMDb rating. The weighted mean rating was lowest for winter releases (7.17) and similar for spring, summer and autumn (7.47 to 7.52), so the differences are small and I did not yet test whether they are </w:t>
+      </w:r>
+      <w:proofErr w:type="spellStart"/>
+      <w:r>
+        <w:t xml:space="preserve">significant. </w:t>
+      </w:r>
+      <w:proofErr w:type="spellEnd"/>
+      <w:r>
+        <w:t>The practice part</w:t>
+      </w:r>
+      <w:r>
+        <w:t xml:space="preserve"> took way longer than expected. It still helped a lot to understand Pandas further (just by reading, it is harder for me to remember things).</w:t>
       </w:r>
     </w:p>
     <w:p>
@@ -132,7 +155,13 @@
       </w:r>
       <w:proofErr w:type="spellEnd"/>
       <w:r>
-        <w:t xml:space="preserve"> app (“Snow Guru”) about skiing and snow, in general, in Switzerland. As I love skiing on the slopes and Dimi does ski touring, we would like to build some features for facilitating our hobbies. </w:t>
+        <w:t xml:space="preserve"> app (“Snow Guru”) about skiing and snow, in general, in Switzerland. As I love skiing on the slopes and Dimi does ski touring, we would like to build some features </w:t>
+      </w:r>
+      <w:r>
+        <w:t xml:space="preserve">to support </w:t>
+      </w:r>
+      <w:r>
+        <w:t xml:space="preserve">our hobbies. </w:t>
       </w:r>
       <w:r>
         <w:t>Two</w:t>
@@ -147,7 +176,7 @@
         <w:t xml:space="preserve"> be </w:t>
       </w:r>
       <w:r>
-        <w:t>a snow melt model for ski touring and a comparison of ski resorts, giving the user a ranking of which ski resort will have the highest “consumer surplus” (we will take variables like day pass cost, snow fall, slope kms, distance to ski resort etc. into account).</w:t>
+        <w:t>a snow melt model for ski touring and a comparison of ski resorts, giving the user a ranking of which ski resort will have the highest “consumer surplus” (we will take variables like day pass cost, snowfall, slope kms, distance to ski resort etc. into account).</w:t>
       </w:r>
     </w:p>
     <w:p>
@@ -162,6 +191,12 @@
           <w:u w:val="single"/>
         </w:rPr>
         <w:t>What to work on in the next weeks/what I struggle with</w:t>
+      </w:r>
+      <w:r>
+        <w:rPr>
+          <w:u w:val="single"/>
+        </w:rPr>
+        <w:t>:</w:t>
       </w:r>
     </w:p>
     <w:p>
@@ -214,7 +249,18 @@
         <w:spacing w:after="192"/>
       </w:pPr>
       <w:r>
-        <w:t>I also underestimated coming up with an idea that is a good mix between interesting and not too ambitious. It is quite hard to evaluate which ideas would be too hard for us to implement.</w:t>
+        <w:t xml:space="preserve">I also underestimated coming up with </w:t>
+      </w:r>
+      <w:proofErr w:type="spellStart"/>
+      <w:r>
+        <w:t>a</w:t>
+      </w:r>
+      <w:proofErr w:type="spellEnd"/>
+      <w:r>
+        <w:t xml:space="preserve"> project</w:t>
+      </w:r>
+      <w:r>
+        <w:t xml:space="preserve"> idea that is a good mix between interesting and not too ambitious. It is quite hard to evaluate which ideas would be too hard for us to implement.</w:t>
       </w:r>
     </w:p>
     <w:p>

</xml_diff>